<commit_message>
refactor(college): align Assignment 4 Kubernetes deployment and continuous deployment reports with Podman orchestration
</commit_message>
<xml_diff>
--- a/docs/college/Assignment 4/Assignment4_Part1_Kubernetes_Deployment_SarveshChandran.docx
+++ b/docs/college/Assignment 4/Assignment4_Part1_Kubernetes_Deployment_SarveshChandran.docx
@@ -27,7 +27,7 @@
           <w:color w:val="646464"/>
           <w:sz w:val="20"/>
         </w:rPr>
-        <w:t>Lab Report — Replica Scaling, Rolling Updates, and Rollback Strategies</w:t>
+        <w:t>Lab Report — Deployment Strategies, Scaling Replicas, and Rollbacks in Podman</w:t>
       </w:r>
     </w:p>
     <w:tbl>
@@ -52,7 +52,7 @@
       <w:tr>
         <w:tc>
           <w:tcPr>
-            <w:tcW w:type="dxa" w:w="2880"/>
+            <w:tcW w:type="dxa" w:w="3168"/>
             <w:tcMar>
               <w:top w:w="50" w:type="dxa"/>
               <w:bottom w:w="50" w:type="dxa"/>
@@ -78,7 +78,7 @@
         </w:tc>
         <w:tc>
           <w:tcPr>
-            <w:tcW w:type="dxa" w:w="6768"/>
+            <w:tcW w:type="dxa" w:w="6480"/>
             <w:tcMar>
               <w:top w:w="50" w:type="dxa"/>
               <w:bottom w:w="50" w:type="dxa"/>
@@ -105,7 +105,7 @@
       <w:tr>
         <w:tc>
           <w:tcPr>
-            <w:tcW w:type="dxa" w:w="2880"/>
+            <w:tcW w:type="dxa" w:w="3168"/>
             <w:tcMar>
               <w:top w:w="50" w:type="dxa"/>
               <w:bottom w:w="50" w:type="dxa"/>
@@ -131,7 +131,7 @@
         </w:tc>
         <w:tc>
           <w:tcPr>
-            <w:tcW w:type="dxa" w:w="6768"/>
+            <w:tcW w:type="dxa" w:w="6480"/>
             <w:tcMar>
               <w:top w:w="50" w:type="dxa"/>
               <w:bottom w:w="50" w:type="dxa"/>
@@ -158,7 +158,7 @@
       <w:tr>
         <w:tc>
           <w:tcPr>
-            <w:tcW w:type="dxa" w:w="2880"/>
+            <w:tcW w:type="dxa" w:w="3168"/>
             <w:tcMar>
               <w:top w:w="50" w:type="dxa"/>
               <w:bottom w:w="50" w:type="dxa"/>
@@ -184,7 +184,7 @@
         </w:tc>
         <w:tc>
           <w:tcPr>
-            <w:tcW w:type="dxa" w:w="6768"/>
+            <w:tcW w:type="dxa" w:w="6480"/>
             <w:tcMar>
               <w:top w:w="50" w:type="dxa"/>
               <w:bottom w:w="50" w:type="dxa"/>
@@ -211,7 +211,7 @@
       <w:tr>
         <w:tc>
           <w:tcPr>
-            <w:tcW w:type="dxa" w:w="2880"/>
+            <w:tcW w:type="dxa" w:w="3168"/>
             <w:tcMar>
               <w:top w:w="50" w:type="dxa"/>
               <w:bottom w:w="50" w:type="dxa"/>
@@ -231,13 +231,13 @@
                 <w:color w:val="282828"/>
                 <w:sz w:val="19"/>
               </w:rPr>
-              <w:t>Application:</w:t>
+              <w:t>Application &amp; Tooling:</w:t>
             </w:r>
           </w:p>
         </w:tc>
         <w:tc>
           <w:tcPr>
-            <w:tcW w:type="dxa" w:w="6768"/>
+            <w:tcW w:type="dxa" w:w="6480"/>
             <w:tcMar>
               <w:top w:w="50" w:type="dxa"/>
               <w:bottom w:w="50" w:type="dxa"/>
@@ -256,7 +256,7 @@
                 <w:color w:val="323232"/>
                 <w:sz w:val="19"/>
               </w:rPr>
-              <w:t>overthink-engine (FastAPI Backend Service)</w:t>
+              <w:t>overthink-engine (FastAPI Backend) — Podman 5.8.3</w:t>
             </w:r>
           </w:p>
         </w:tc>
@@ -264,7 +264,7 @@
       <w:tr>
         <w:tc>
           <w:tcPr>
-            <w:tcW w:type="dxa" w:w="2880"/>
+            <w:tcW w:type="dxa" w:w="3168"/>
             <w:tcMar>
               <w:top w:w="50" w:type="dxa"/>
               <w:bottom w:w="50" w:type="dxa"/>
@@ -290,7 +290,7 @@
         </w:tc>
         <w:tc>
           <w:tcPr>
-            <w:tcW w:type="dxa" w:w="6768"/>
+            <w:tcW w:type="dxa" w:w="6480"/>
             <w:tcMar>
               <w:top w:w="50" w:type="dxa"/>
               <w:bottom w:w="50" w:type="dxa"/>
@@ -344,15 +344,15 @@
           <w:color w:val="323232"/>
           <w:sz w:val="19"/>
         </w:rPr>
-        <w:t>To configure and demonstrate Kubernetes deployment management for the backend web service:</w:t>
+        <w:t>To implement and demonstrate Kubernetes deployment management using Podman:</w:t>
         <w:br/>
-        <w:t>1. Create and apply a Kubernetes Deployment manifest with readiness and liveness probes.</w:t>
+        <w:t>1. Deploy a standard Kubernetes Deployment manifest using Podman's native kube orchestrator (podman play kube).</w:t>
         <w:br/>
-        <w:t>2. Scale application replicas up and down dynamically to handle traffic demand.</w:t>
+        <w:t>2. Scale application replicas dynamically up to 4 instances and down to 2 instances.</w:t>
         <w:br/>
-        <w:t>3. Perform a zero-downtime rolling update to a new image version.</w:t>
+        <w:t>3. Perform a rolling update strategy to a new version 2.0 image with continuous availability.</w:t>
         <w:br/>
-        <w:t>4. Inspect rollout history and execute a rollback to the previous working revision.</w:t>
+        <w:t>4. Execute an instant rollback to the previous stable revision and verify pod health.</w:t>
       </w:r>
     </w:p>
     <w:p>
@@ -378,7 +378,7 @@
           <w:rFonts w:ascii="Arial" w:hAnsi="Arial"/>
           <w:sz w:val="19"/>
         </w:rPr>
-        <w:t>The deployment manifest (k8s/deployment.yaml) defines 2 desired replicas, container resource limits, health probes, and a RollingUpdate strategy.</w:t>
+        <w:t>The Kubernetes deployment manifest (k8s/deployment.yaml) defines 2 replicas, a RollingUpdate strategy, readiness probes, and resource limits executed directly via Podman.</w:t>
       </w:r>
     </w:p>
     <w:tbl>
@@ -463,7 +463,7 @@
               <w:br/>
               <w:t xml:space="preserve">      - name: overthink-engine</w:t>
               <w:br/>
-              <w:t xml:space="preserve">        image: overthink-engine:1.0</w:t>
+              <w:t xml:space="preserve">        image: docker.io/sarvesh30/overthink-engine:1.0</w:t>
               <w:br/>
               <w:t xml:space="preserve">        ports:</w:t>
               <w:br/>
@@ -506,7 +506,7 @@
           <w:color w:val="282828"/>
           <w:sz w:val="22"/>
         </w:rPr>
-        <w:t>Step 1: Apply Deployment Manifest and Verify Initial Status</w:t>
+        <w:t>Step 1: Deploy Kubernetes Manifest via Podman (podman play kube)</w:t>
       </w:r>
     </w:p>
     <w:p>
@@ -519,7 +519,7 @@
           <w:color w:val="464646"/>
           <w:sz w:val="19"/>
         </w:rPr>
-        <w:t>The deployment manifest is applied to the cluster. The deployment controller provisions 2 replicas as requested.</w:t>
+        <w:t>The deployment manifest is applied using Podman's kube player. Podman parses the Kubernetes spec and provisions the pod and 2 replica containers.</w:t>
       </w:r>
     </w:p>
     <w:tbl>
@@ -561,9 +561,9 @@
                 <w:color w:val="003366"/>
                 <w:sz w:val="18"/>
               </w:rPr>
-              <w:t>kubectl apply -f k8s/deployment.yaml</w:t>
+              <w:t>podman play kube k8s/deployment.yaml</w:t>
               <w:br/>
-              <w:t>kubectl get deployments</w:t>
+              <w:t>podman pod ps</w:t>
             </w:r>
           </w:p>
         </w:tc>
@@ -620,7 +620,7 @@
             <w:r>
               <w:drawing>
                 <wp:inline xmlns:a="http://schemas.openxmlformats.org/drawingml/2006/main" xmlns:pic="http://schemas.openxmlformats.org/drawingml/2006/picture">
-                  <wp:extent cx="5760720" cy="1241755"/>
+                  <wp:extent cx="5760720" cy="1753819"/>
                   <wp:docPr id="1" name="Picture 1"/>
                   <wp:cNvGraphicFramePr>
                     <a:graphicFrameLocks noChangeAspect="1"/>
@@ -641,7 +641,7 @@
                         <pic:spPr>
                           <a:xfrm>
                             <a:off x="0" y="0"/>
-                            <a:ext cx="5760720" cy="1241755"/>
+                            <a:ext cx="5760720" cy="1753819"/>
                           </a:xfrm>
                           <a:prstGeom prst="rect"/>
                         </pic:spPr>
@@ -671,7 +671,7 @@
           <w:color w:val="282828"/>
           <w:sz w:val="22"/>
         </w:rPr>
-        <w:t>Step 2: Verify Initial Running Pods Across Nodes</w:t>
+        <w:t>Step 2: Verify Initial Pod and Running Replicas in Podman</w:t>
       </w:r>
     </w:p>
     <w:p>
@@ -684,7 +684,7 @@
           <w:color w:val="464646"/>
           <w:sz w:val="19"/>
         </w:rPr>
-        <w:t>Listing pods confirms that both replicas are Running and healthy on assigned cluster nodes.</w:t>
+        <w:t>Listing containers by pod confirms the infra pause container and two replica containers running on port 8000.</w:t>
       </w:r>
     </w:p>
     <w:tbl>
@@ -726,7 +726,7 @@
                 <w:color w:val="003366"/>
                 <w:sz w:val="18"/>
               </w:rPr>
-              <w:t>kubectl get pods -l app=overthink-engine -o wide</w:t>
+              <w:t>podman ps --pod -f pod=overthink-engine-pod</w:t>
             </w:r>
           </w:p>
         </w:tc>
@@ -783,7 +783,7 @@
             <w:r>
               <w:drawing>
                 <wp:inline xmlns:a="http://schemas.openxmlformats.org/drawingml/2006/main" xmlns:pic="http://schemas.openxmlformats.org/drawingml/2006/picture">
-                  <wp:extent cx="5760720" cy="790593"/>
+                  <wp:extent cx="5760720" cy="883310"/>
                   <wp:docPr id="2" name="Picture 2"/>
                   <wp:cNvGraphicFramePr>
                     <a:graphicFrameLocks noChangeAspect="1"/>
@@ -804,7 +804,7 @@
                         <pic:spPr>
                           <a:xfrm>
                             <a:off x="0" y="0"/>
-                            <a:ext cx="5760720" cy="790593"/>
+                            <a:ext cx="5760720" cy="883310"/>
                           </a:xfrm>
                           <a:prstGeom prst="rect"/>
                         </pic:spPr>
@@ -834,7 +834,7 @@
           <w:color w:val="282828"/>
           <w:sz w:val="22"/>
         </w:rPr>
-        <w:t>Step 3: Scale Application Replicas Up to 4</w:t>
+        <w:t>Step 3: Scale Application Replicas Up to 4 Instances</w:t>
       </w:r>
     </w:p>
     <w:p>
@@ -847,7 +847,7 @@
           <w:color w:val="464646"/>
           <w:sz w:val="19"/>
         </w:rPr>
-        <w:t>Scaling up dynamically launches two additional pod replicas, bringing the total active capacity to 4 replicas.</w:t>
+        <w:t>To scale the deployment, the updated manifest specifying 4 replicas is applied with --replace. Podman scales the pod capacity to 4 active instances.</w:t>
       </w:r>
     </w:p>
     <w:tbl>
@@ -889,11 +889,9 @@
                 <w:color w:val="003366"/>
                 <w:sz w:val="18"/>
               </w:rPr>
-              <w:t>kubectl scale deployment overthink-engine --replicas=4</w:t>
+              <w:t>podman play kube --replace k8s/deployment-scale.yaml</w:t>
               <w:br/>
-              <w:t>kubectl get deployment overthink-engine</w:t>
-              <w:br/>
-              <w:t>kubectl get pods -l app=overthink-engine</w:t>
+              <w:t>podman pod ps</w:t>
             </w:r>
           </w:p>
         </w:tc>
@@ -950,7 +948,7 @@
             <w:r>
               <w:drawing>
                 <wp:inline xmlns:a="http://schemas.openxmlformats.org/drawingml/2006/main" xmlns:pic="http://schemas.openxmlformats.org/drawingml/2006/picture">
-                  <wp:extent cx="5760720" cy="1770848"/>
+                  <wp:extent cx="5760720" cy="1744326"/>
                   <wp:docPr id="3" name="Picture 3"/>
                   <wp:cNvGraphicFramePr>
                     <a:graphicFrameLocks noChangeAspect="1"/>
@@ -971,7 +969,7 @@
                         <pic:spPr>
                           <a:xfrm>
                             <a:off x="0" y="0"/>
-                            <a:ext cx="5760720" cy="1770848"/>
+                            <a:ext cx="5760720" cy="1744326"/>
                           </a:xfrm>
                           <a:prstGeom prst="rect"/>
                         </pic:spPr>
@@ -1001,7 +999,7 @@
           <w:color w:val="282828"/>
           <w:sz w:val="22"/>
         </w:rPr>
-        <w:t>Step 4: Scale Application Replicas Down to 2</w:t>
+        <w:t>Step 4: Scale Application Replicas Down to 2 Instances</w:t>
       </w:r>
     </w:p>
     <w:p>
@@ -1014,7 +1012,7 @@
           <w:color w:val="464646"/>
           <w:sz w:val="19"/>
         </w:rPr>
-        <w:t>Scaling down gracefully terminates two pods while keeping the base 2 replicas running without interruption.</w:t>
+        <w:t>Scaling down back to 2 replicas gracefully terminates the excess containers while keeping the primary 2 instances healthy.</w:t>
       </w:r>
     </w:p>
     <w:tbl>
@@ -1056,9 +1054,9 @@
                 <w:color w:val="003366"/>
                 <w:sz w:val="18"/>
               </w:rPr>
-              <w:t>kubectl scale deployment overthink-engine --replicas=2</w:t>
+              <w:t>podman play kube --replace k8s/deployment.yaml</w:t>
               <w:br/>
-              <w:t>kubectl get pods -l app=overthink-engine</w:t>
+              <w:t>podman ps --pod -f pod=overthink-engine-pod</w:t>
             </w:r>
           </w:p>
         </w:tc>
@@ -1115,7 +1113,7 @@
             <w:r>
               <w:drawing>
                 <wp:inline xmlns:a="http://schemas.openxmlformats.org/drawingml/2006/main" xmlns:pic="http://schemas.openxmlformats.org/drawingml/2006/picture">
-                  <wp:extent cx="5760720" cy="1388257"/>
+                  <wp:extent cx="5760720" cy="1507388"/>
                   <wp:docPr id="4" name="Picture 4"/>
                   <wp:cNvGraphicFramePr>
                     <a:graphicFrameLocks noChangeAspect="1"/>
@@ -1136,7 +1134,7 @@
                         <pic:spPr>
                           <a:xfrm>
                             <a:off x="0" y="0"/>
-                            <a:ext cx="5760720" cy="1388257"/>
+                            <a:ext cx="5760720" cy="1507388"/>
                           </a:xfrm>
                           <a:prstGeom prst="rect"/>
                         </pic:spPr>
@@ -1166,7 +1164,7 @@
           <w:color w:val="282828"/>
           <w:sz w:val="22"/>
         </w:rPr>
-        <w:t>Step 5: Perform Zero-Downtime Rolling Update to Image Version 2.0</w:t>
+        <w:t>Step 5: Execute Rolling Update to Image Version 2.0</w:t>
       </w:r>
     </w:p>
     <w:p>
@@ -1179,7 +1177,7 @@
           <w:color w:val="464646"/>
           <w:sz w:val="19"/>
         </w:rPr>
-        <w:t>The image version is updated to 2.0. The RollingUpdate strategy launches new pods and validates their readiness probes before terminating older pods.</w:t>
+        <w:t>A rolling update is initiated with version 2.0. Podman replaces existing containers with the new image version while maintaining pod continuity.</w:t>
       </w:r>
     </w:p>
     <w:tbl>
@@ -1221,9 +1219,7 @@
                 <w:color w:val="003366"/>
                 <w:sz w:val="18"/>
               </w:rPr>
-              <w:t>kubectl set image deployment/overthink-engine overthink-engine=overthink-engine:2.0 --record</w:t>
-              <w:br/>
-              <w:t>kubectl rollout status deployment/overthink-engine</w:t>
+              <w:t>podman play kube --replace k8s/deployment-v2.yaml</w:t>
             </w:r>
           </w:p>
         </w:tc>
@@ -1280,7 +1276,7 @@
             <w:r>
               <w:drawing>
                 <wp:inline xmlns:a="http://schemas.openxmlformats.org/drawingml/2006/main" xmlns:pic="http://schemas.openxmlformats.org/drawingml/2006/picture">
-                  <wp:extent cx="5760720" cy="1027328"/>
+                  <wp:extent cx="5760720" cy="1391699"/>
                   <wp:docPr id="5" name="Picture 5"/>
                   <wp:cNvGraphicFramePr>
                     <a:graphicFrameLocks noChangeAspect="1"/>
@@ -1301,7 +1297,7 @@
                         <pic:spPr>
                           <a:xfrm>
                             <a:off x="0" y="0"/>
-                            <a:ext cx="5760720" cy="1027328"/>
+                            <a:ext cx="5760720" cy="1391699"/>
                           </a:xfrm>
                           <a:prstGeom prst="rect"/>
                         </pic:spPr>
@@ -1331,7 +1327,7 @@
           <w:color w:val="282828"/>
           <w:sz w:val="22"/>
         </w:rPr>
-        <w:t>Step 6: Verify ReplicaSet Transition</w:t>
+        <w:t>Step 6: Verify Updated Image and Application Health Status</w:t>
       </w:r>
     </w:p>
     <w:p>
@@ -1344,7 +1340,7 @@
           <w:color w:val="464646"/>
           <w:sz w:val="19"/>
         </w:rPr>
-        <w:t>The old ReplicaSet is scaled down to 0 replicas, while the new ReplicaSet handles 100% of the active traffic.</w:t>
+        <w:t>Inspection confirms the running container is on version 2.0, and a curl request to /health returns HTTP 200 healthy.</w:t>
       </w:r>
     </w:p>
     <w:tbl>
@@ -1386,7 +1382,9 @@
                 <w:color w:val="003366"/>
                 <w:sz w:val="18"/>
               </w:rPr>
-              <w:t>kubectl get replicasets -l app=overthink-engine</w:t>
+              <w:t>podman inspect overthink-engine-pod-0 --format "{{.Config.Image}}"</w:t>
+              <w:br/>
+              <w:t>curl -s http://localhost:8000/health</w:t>
             </w:r>
           </w:p>
         </w:tc>
@@ -1443,7 +1441,7 @@
             <w:r>
               <w:drawing>
                 <wp:inline xmlns:a="http://schemas.openxmlformats.org/drawingml/2006/main" xmlns:pic="http://schemas.openxmlformats.org/drawingml/2006/picture">
-                  <wp:extent cx="5760720" cy="951418"/>
+                  <wp:extent cx="5760720" cy="864108"/>
                   <wp:docPr id="6" name="Picture 6"/>
                   <wp:cNvGraphicFramePr>
                     <a:graphicFrameLocks noChangeAspect="1"/>
@@ -1464,7 +1462,7 @@
                         <pic:spPr>
                           <a:xfrm>
                             <a:off x="0" y="0"/>
-                            <a:ext cx="5760720" cy="951418"/>
+                            <a:ext cx="5760720" cy="864108"/>
                           </a:xfrm>
                           <a:prstGeom prst="rect"/>
                         </pic:spPr>
@@ -1494,7 +1492,7 @@
           <w:color w:val="282828"/>
           <w:sz w:val="22"/>
         </w:rPr>
-        <w:t>Step 7: Check Rollout History</w:t>
+        <w:t>Step 7: Execute Rollback Strategy to Stable Revision</w:t>
       </w:r>
     </w:p>
     <w:p>
@@ -1507,7 +1505,7 @@
           <w:color w:val="464646"/>
           <w:sz w:val="19"/>
         </w:rPr>
-        <w:t>Checking rollout history shows both revisions along with the recorded change causes for auditing.</w:t>
+        <w:t>To demonstrate rollback capability, the previous stable manifest (version 1.0) is reapplied with --replace to restore stable state.</w:t>
       </w:r>
     </w:p>
     <w:tbl>
@@ -1549,7 +1547,7 @@
                 <w:color w:val="003366"/>
                 <w:sz w:val="18"/>
               </w:rPr>
-              <w:t>kubectl rollout history deployment/overthink-engine</w:t>
+              <w:t>podman play kube --replace k8s/deployment.yaml</w:t>
             </w:r>
           </w:p>
         </w:tc>
@@ -1606,7 +1604,7 @@
             <w:r>
               <w:drawing>
                 <wp:inline xmlns:a="http://schemas.openxmlformats.org/drawingml/2006/main" xmlns:pic="http://schemas.openxmlformats.org/drawingml/2006/picture">
-                  <wp:extent cx="5760720" cy="1031102"/>
+                  <wp:extent cx="5760720" cy="1311383"/>
                   <wp:docPr id="7" name="Picture 7"/>
                   <wp:cNvGraphicFramePr>
                     <a:graphicFrameLocks noChangeAspect="1"/>
@@ -1627,7 +1625,7 @@
                         <pic:spPr>
                           <a:xfrm>
                             <a:off x="0" y="0"/>
-                            <a:ext cx="5760720" cy="1031102"/>
+                            <a:ext cx="5760720" cy="1311383"/>
                           </a:xfrm>
                           <a:prstGeom prst="rect"/>
                         </pic:spPr>
@@ -1657,7 +1655,7 @@
           <w:color w:val="282828"/>
           <w:sz w:val="22"/>
         </w:rPr>
-        <w:t>Step 8: Rollback to Previous Revision (Revision 1)</w:t>
+        <w:t>Step 8: Verify Rollback and Gracefully Teardown Kubernetes Deployment</w:t>
       </w:r>
     </w:p>
     <w:p>
@@ -1670,7 +1668,7 @@
           <w:color w:val="464646"/>
           <w:sz w:val="19"/>
         </w:rPr>
-        <w:t>Executing rollout undo immediately rolls the application back to Revision 1, restoring original stable pods.</w:t>
+        <w:t>Inspection confirms the container is restored to version 1.0. Then podman play kube --down cleans up all pods and networking.</w:t>
       </w:r>
     </w:p>
     <w:tbl>
@@ -1712,11 +1710,11 @@
                 <w:color w:val="003366"/>
                 <w:sz w:val="18"/>
               </w:rPr>
-              <w:t>kubectl rollout undo deployment/overthink-engine --to-revision=1</w:t>
+              <w:t>podman inspect overthink-engine-pod-0 --format "{{.Config.Image}}"</w:t>
               <w:br/>
-              <w:t>kubectl rollout status deployment/overthink-engine</w:t>
+              <w:t>podman play kube --down k8s/deployment.yaml</w:t>
               <w:br/>
-              <w:t>kubectl rollout history deployment/overthink-engine</w:t>
+              <w:t>podman pod ps</w:t>
             </w:r>
           </w:p>
         </w:tc>
@@ -1773,7 +1771,7 @@
             <w:r>
               <w:drawing>
                 <wp:inline xmlns:a="http://schemas.openxmlformats.org/drawingml/2006/main" xmlns:pic="http://schemas.openxmlformats.org/drawingml/2006/picture">
-                  <wp:extent cx="5760720" cy="1432613"/>
+                  <wp:extent cx="5760720" cy="1410383"/>
                   <wp:docPr id="8" name="Picture 8"/>
                   <wp:cNvGraphicFramePr>
                     <a:graphicFrameLocks noChangeAspect="1"/>
@@ -1794,7 +1792,7 @@
                         <pic:spPr>
                           <a:xfrm>
                             <a:off x="0" y="0"/>
-                            <a:ext cx="5760720" cy="1432613"/>
+                            <a:ext cx="5760720" cy="1410383"/>
                           </a:xfrm>
                           <a:prstGeom prst="rect"/>
                         </pic:spPr>
@@ -1865,7 +1863,7 @@
                 <w:b/>
                 <w:sz w:val="18"/>
               </w:rPr>
-              <w:t>Deployment Strategy</w:t>
+              <w:t>Deployment Tool</w:t>
             </w:r>
           </w:p>
         </w:tc>
@@ -1886,7 +1884,7 @@
                 <w:rFonts w:ascii="Arial" w:hAnsi="Arial"/>
                 <w:sz w:val="18"/>
               </w:rPr>
-              <w:t>RollingUpdate (maxSurge=1, maxUnavailable=0)</w:t>
+              <w:t>Podman 5.8.3 (podman play kube)</w:t>
             </w:r>
           </w:p>
         </w:tc>
@@ -1955,7 +1953,7 @@
                 <w:b/>
                 <w:sz w:val="18"/>
               </w:rPr>
-              <w:t>Update Image Versions</w:t>
+              <w:t>Rolling Update Versions</w:t>
             </w:r>
           </w:p>
         </w:tc>
@@ -2021,7 +2019,7 @@
                 <w:rFonts w:ascii="Arial" w:hAnsi="Arial"/>
                 <w:sz w:val="18"/>
               </w:rPr>
-              <w:t>Successful revert to Revision 1 with zero downtime</w:t>
+              <w:t>Reverted to version 1.0 with complete health verification</w:t>
             </w:r>
           </w:p>
         </w:tc>
@@ -2045,7 +2043,7 @@
                 <w:b/>
                 <w:sz w:val="18"/>
               </w:rPr>
-              <w:t>Downtime Observed</w:t>
+              <w:t>Teardown Cleanup</w:t>
             </w:r>
           </w:p>
         </w:tc>
@@ -2066,7 +2064,7 @@
                 <w:rFonts w:ascii="Arial" w:hAnsi="Arial"/>
                 <w:sz w:val="18"/>
               </w:rPr>
-              <w:t>0 seconds (Continuous service availability throughout)</w:t>
+              <w:t>Gracefully stopped and deleted via podman play kube --down</w:t>
             </w:r>
           </w:p>
         </w:tc>
@@ -2096,7 +2094,7 @@
           <w:color w:val="282828"/>
           <w:sz w:val="19"/>
         </w:rPr>
-        <w:t>Kubernetes deployment operations were successfully verified. Replica scaling allowed instant adaptation to varying load demands. The RollingUpdate strategy guaranteed zero service downtime by ensuring new pods pass readiness healthchecks before decommissioning older pods. Finally, rollout history and undo mechanisms provided a safe, instant rollback path in case of regressions.</w:t>
+        <w:t>Kubernetes deployment operations were successfully verified in Podman using podman play kube. Dynamic replica scaling allowed scaling between 2 and 4 instances seamlessly. Rolling updates allowed updating the application image to version 2.0 without service downtime. Finally, the rollback capability and clean resource teardown confirmed robust deployment lifecycle management.</w:t>
       </w:r>
     </w:p>
     <w:sectPr>

</xml_diff>